<commit_message>
EXC-1 triage: R-07b(a)/R-12b(c)/R-12c(c) docx fix
R-07b: rule(a) - C2 variant of R-07 with code (repair/pickup/queue)
  - removed docx row; noted in R-07 condition col
R-12b/R-12c: rule(c) - not real screens, not in SCREEN_MAP or code
  - no docx rows existed, 0 action needed

Re-parse: R-07b/R-12b/R-12c 0 docx-not-code | rows 112->111
Build: exit0 | Jest: 88/88 (code unchanged)

Co-Authored-By: Claude Sonnet 4.6 <noreply@anthropic.com>
</commit_message>
<xml_diff>
--- a/docs/WeeeR_Screens.docx
+++ b/docs/WeeeR_Screens.docx
@@ -2949,7 +2949,12 @@
               <w:rPr>
                 <w:sz w:val="16"/>
               </w:rPr>
-              <w:t>C3 SHIPPING service</w:t>
+            </w:r>
+            <w:r>
+              <w:rPr>
+                <w:sz w:val="16"/>
+              </w:rPr>
+              <w:t>C3 SHIPPING service / C2 variant -&gt; R-07b: /repair/pickup/queue (PICKUP_DELIVERY)</w:t>
             </w:r>
           </w:p>
         </w:tc>
@@ -3035,163 +3040,6 @@
                 <w:sz w:val="16"/>
               </w:rPr>
               <w:t>http://localhost:3001/repair/parcel/queue</w:t>
-            </w:r>
-          </w:p>
-        </w:tc>
-      </w:tr>
-      <w:tr>
-        <w:tc>
-          <w:tcPr>
-            <w:tcW w:type="dxa" w:w="1571"/>
-            <w:shd w:val="clear" w:color="auto" w:fill="FFF8F5"/>
-          </w:tcPr>
-          <w:p>
-            <w:pPr>
-              <w:jc w:val="left"/>
-            </w:pPr>
-            <w:r>
-              <w:rPr>
-                <w:b/>
-                <w:color w:val="B8300E"/>
-                <w:sz w:val="16"/>
-              </w:rPr>
-              <w:t>R-07b</w:t>
-            </w:r>
-          </w:p>
-        </w:tc>
-        <w:tc>
-          <w:tcPr>
-            <w:tcW w:type="dxa" w:w="1571"/>
-            <w:shd w:val="clear" w:color="auto" w:fill="FFF8F5"/>
-          </w:tcPr>
-          <w:p>
-            <w:pPr>
-              <w:jc w:val="left"/>
-            </w:pPr>
-            <w:r>
-              <w:rPr>
-                <w:sz w:val="16"/>
-              </w:rPr>
-              <w:t>คิว Pickup</w:t>
-            </w:r>
-          </w:p>
-        </w:tc>
-        <w:tc>
-          <w:tcPr>
-            <w:tcW w:type="dxa" w:w="1571"/>
-            <w:shd w:val="clear" w:color="auto" w:fill="FFF8F5"/>
-          </w:tcPr>
-          <w:p>
-            <w:pPr>
-              <w:jc w:val="left"/>
-            </w:pPr>
-            <w:r>
-              <w:rPr>
-                <w:sz w:val="16"/>
-              </w:rPr>
-              <w:t>R-64</w:t>
-            </w:r>
-          </w:p>
-        </w:tc>
-        <w:tc>
-          <w:tcPr>
-            <w:tcW w:type="dxa" w:w="1571"/>
-            <w:shd w:val="clear" w:color="auto" w:fill="FFF8F5"/>
-          </w:tcPr>
-          <w:p>
-            <w:pPr>
-              <w:jc w:val="left"/>
-            </w:pPr>
-            <w:r>
-              <w:rPr>
-                <w:sz w:val="16"/>
-              </w:rPr>
-              <w:t>C2 PICKUP_DELIVERY</w:t>
-            </w:r>
-          </w:p>
-        </w:tc>
-        <w:tc>
-          <w:tcPr>
-            <w:tcW w:type="dxa" w:w="1571"/>
-            <w:shd w:val="clear" w:color="auto" w:fill="FFF8F5"/>
-          </w:tcPr>
-          <w:p>
-            <w:pPr>
-              <w:jc w:val="left"/>
-            </w:pPr>
-            <w:r>
-              <w:rPr>
-                <w:sz w:val="16"/>
-              </w:rPr>
-              <w:t>R-65</w:t>
-            </w:r>
-          </w:p>
-        </w:tc>
-        <w:tc>
-          <w:tcPr>
-            <w:tcW w:type="dxa" w:w="1571"/>
-            <w:shd w:val="clear" w:color="auto" w:fill="FFF8F5"/>
-          </w:tcPr>
-          <w:p>
-            <w:pPr>
-              <w:jc w:val="left"/>
-            </w:pPr>
-            <w:r>
-              <w:rPr>
-                <w:sz w:val="16"/>
-              </w:rPr>
-              <w:t>-</w:t>
-            </w:r>
-          </w:p>
-        </w:tc>
-        <w:tc>
-          <w:tcPr>
-            <w:tcW w:type="dxa" w:w="1571"/>
-            <w:shd w:val="clear" w:color="auto" w:fill="FFF8F5"/>
-          </w:tcPr>
-          <w:p>
-            <w:pPr>
-              <w:jc w:val="left"/>
-            </w:pPr>
-            <w:r>
-              <w:rPr>
-                <w:sz w:val="16"/>
-              </w:rPr>
-              <w:t>รายการงาน pickup</w:t>
-            </w:r>
-          </w:p>
-        </w:tc>
-        <w:tc>
-          <w:tcPr>
-            <w:tcW w:type="dxa" w:w="1571"/>
-            <w:shd w:val="clear" w:color="auto" w:fill="FFF8F5"/>
-          </w:tcPr>
-          <w:p>
-            <w:pPr>
-              <w:jc w:val="left"/>
-            </w:pPr>
-            <w:r>
-              <w:rPr>
-                <w:sz w:val="16"/>
-              </w:rPr>
-              <w:t>C2 queue</w:t>
-            </w:r>
-          </w:p>
-        </w:tc>
-        <w:tc>
-          <w:tcPr>
-            <w:tcW w:type="dxa" w:w="1571"/>
-            <w:shd w:val="clear" w:color="auto" w:fill="FFF8F5"/>
-          </w:tcPr>
-          <w:p>
-            <w:pPr>
-              <w:jc w:val="left"/>
-            </w:pPr>
-            <w:r>
-              <w:rPr>
-                <w:sz w:val="16"/>
-              </w:rPr>
-              <w:t>http://localhost:3001/repair/pickup/queue</w:t>
             </w:r>
           </w:p>
         </w:tc>

</xml_diff>

<commit_message>
[WeeeR] CMD#115-P-BC Task1: treefix A/B/C
A) docs/WeeeR_Screens.docx — เพิ่มแถว R-07b (/repair/pickup/queue)
   · แทรกระหว่าง R-07 (parcel queue) กับ R-08 · รหัส C2 PICKUP_DELIVERY · → R-65
   · denominator ครบ 111 จอ

B) 8 case-code หลุด heading → MockAnno §7 comment
   · P2 (parts/my-listings/[id]), P5×2 (my-listings + my-orders)
   · P7 (parts/my-orders/[id]), B6 (resell/buy)
   · R5 (resell/listings/[id]), R8/R10 (transactions + Dispute→ข้อพิพาท), R12
   · bare Dispute → ข้อพิพาท (Dispute)

C) MockAnnoXApp port normalize — WeeeU 3002, WeeeT 3003, Admin 3000
   · dashboard, repair/dashboard, repair/announcements offer
   · parts, scrap/announcements offer

build PASS · test 88/88

Co-Authored-By: Claude Sonnet 4.6 <noreply@anthropic.com>
</commit_message>
<xml_diff>
--- a/docs/WeeeR_Screens.docx
+++ b/docs/WeeeR_Screens.docx
@@ -2949,11 +2949,6 @@
               <w:rPr>
                 <w:sz w:val="16"/>
               </w:rPr>
-            </w:r>
-            <w:r>
-              <w:rPr>
-                <w:sz w:val="16"/>
-              </w:rPr>
               <w:t>C3 SHIPPING service / C2 variant -&gt; R-07b: /repair/pickup/queue (PICKUP_DELIVERY)</w:t>
             </w:r>
           </w:p>
@@ -3040,6 +3035,163 @@
                 <w:sz w:val="16"/>
               </w:rPr>
               <w:t>http://localhost:3001/repair/parcel/queue</w:t>
+            </w:r>
+          </w:p>
+        </w:tc>
+      </w:tr>
+      <w:tr>
+        <w:tc>
+          <w:tcPr>
+            <w:tcW w:type="dxa" w:w="1571"/>
+            <w:shd w:val="clear" w:color="auto" w:fill="FFFFFF"/>
+          </w:tcPr>
+          <w:p>
+            <w:pPr>
+              <w:jc w:val="left"/>
+            </w:pPr>
+            <w:r>
+              <w:rPr>
+                <w:b/>
+                <w:color w:val="B8300E"/>
+                <w:sz w:val="16"/>
+              </w:rPr>
+              <w:t>R-07b</w:t>
+            </w:r>
+          </w:p>
+        </w:tc>
+        <w:tc>
+          <w:tcPr>
+            <w:tcW w:type="dxa" w:w="1571"/>
+            <w:shd w:val="clear" w:color="auto" w:fill="FFFFFF"/>
+          </w:tcPr>
+          <w:p>
+            <w:pPr>
+              <w:jc w:val="left"/>
+            </w:pPr>
+            <w:r>
+              <w:rPr>
+                <w:sz w:val="16"/>
+              </w:rPr>
+              <w:t>คิวรับ-ส่ง (Pickup)</w:t>
+            </w:r>
+          </w:p>
+        </w:tc>
+        <w:tc>
+          <w:tcPr>
+            <w:tcW w:type="dxa" w:w="1571"/>
+            <w:shd w:val="clear" w:color="auto" w:fill="FFFFFF"/>
+          </w:tcPr>
+          <w:p>
+            <w:pPr>
+              <w:jc w:val="left"/>
+            </w:pPr>
+            <w:r>
+              <w:rPr>
+                <w:sz w:val="16"/>
+              </w:rPr>
+              <w:t>R-64</w:t>
+            </w:r>
+          </w:p>
+        </w:tc>
+        <w:tc>
+          <w:tcPr>
+            <w:tcW w:type="dxa" w:w="1571"/>
+            <w:shd w:val="clear" w:color="auto" w:fill="FFFFFF"/>
+          </w:tcPr>
+          <w:p>
+            <w:pPr>
+              <w:jc w:val="left"/>
+            </w:pPr>
+            <w:r>
+              <w:rPr>
+                <w:sz w:val="16"/>
+              </w:rPr>
+              <w:t>C2 PICKUP_DELIVERY</w:t>
+            </w:r>
+          </w:p>
+        </w:tc>
+        <w:tc>
+          <w:tcPr>
+            <w:tcW w:type="dxa" w:w="1571"/>
+            <w:shd w:val="clear" w:color="auto" w:fill="FFFFFF"/>
+          </w:tcPr>
+          <w:p>
+            <w:pPr>
+              <w:jc w:val="left"/>
+            </w:pPr>
+            <w:r>
+              <w:rPr>
+                <w:sz w:val="16"/>
+              </w:rPr>
+              <w:t>R-65</w:t>
+            </w:r>
+          </w:p>
+        </w:tc>
+        <w:tc>
+          <w:tcPr>
+            <w:tcW w:type="dxa" w:w="1571"/>
+            <w:shd w:val="clear" w:color="auto" w:fill="FFFFFF"/>
+          </w:tcPr>
+          <w:p>
+            <w:pPr>
+              <w:jc w:val="left"/>
+            </w:pPr>
+            <w:r>
+              <w:rPr>
+                <w:sz w:val="16"/>
+              </w:rPr>
+              <w:t>-</w:t>
+            </w:r>
+          </w:p>
+        </w:tc>
+        <w:tc>
+          <w:tcPr>
+            <w:tcW w:type="dxa" w:w="1571"/>
+            <w:shd w:val="clear" w:color="auto" w:fill="FFFFFF"/>
+          </w:tcPr>
+          <w:p>
+            <w:pPr>
+              <w:jc w:val="left"/>
+            </w:pPr>
+            <w:r>
+              <w:rPr>
+                <w:sz w:val="16"/>
+              </w:rPr>
+              <w:t>คิวรับ-ส่งพัสดุ</w:t>
+            </w:r>
+          </w:p>
+        </w:tc>
+        <w:tc>
+          <w:tcPr>
+            <w:tcW w:type="dxa" w:w="1571"/>
+            <w:shd w:val="clear" w:color="auto" w:fill="FFFFFF"/>
+          </w:tcPr>
+          <w:p>
+            <w:pPr>
+              <w:jc w:val="left"/>
+            </w:pPr>
+            <w:r>
+              <w:rPr>
+                <w:sz w:val="16"/>
+              </w:rPr>
+              <w:t>C2 pickup queue</w:t>
+            </w:r>
+          </w:p>
+        </w:tc>
+        <w:tc>
+          <w:tcPr>
+            <w:tcW w:type="dxa" w:w="1571"/>
+            <w:shd w:val="clear" w:color="auto" w:fill="FFFFFF"/>
+          </w:tcPr>
+          <w:p>
+            <w:pPr>
+              <w:jc w:val="left"/>
+            </w:pPr>
+            <w:r>
+              <w:rPr>
+                <w:sz w:val="16"/>
+              </w:rPr>
+              <w:t>http://localhost:3001/repair/pickup/queue</w:t>
             </w:r>
           </w:p>
         </w:tc>

</xml_diff>